<commit_message>
Fase 6: rechazar bots recortados por el capping (regla R3a)
La Fase 3 recorta el total inflado x80 y marca flag_outlier, y la regla
aritmetica se salta las filas outlier, asi que 8 de los 12 bots entraban a
transacciones_limpias con un monto falso. flag_total_inconsistente (Fase 2)
se lleva al unificado y la nueva regla R3a manda esos pedidos a cuarentena.

Resultado: 1,049 validas y 140 en cuarentena (antes 1,057 / 132), 0 bots en
la tabla limpia. Se agrega una prueba de estres (25 casos) y se regeneran
pipeline.db, el reporte de las fases 5-7, README y REGLAS_DE_NEGOCIO.

Co-Authored-By: Claude Sonnet 5.5 <noreply@anthropic.com>
</commit_message>
<xml_diff>
--- a/Reporte_Fase5_Fase6_Fase7_Validacion_y_Carga.docx
+++ b/Reporte_Fase5_Fase6_Fase7_Validacion_y_Carga.docx
@@ -72,7 +72,7 @@
         <w:spacing w:after="120"/>
       </w:pPr>
       <w:r>
-        <w:t>De 1,189 registros, 1,057 (88.9%) pasaron el esquema y 132 (11.1%) se desviaron a cuarentena con su motivo documentado. Ninguna fila se perdió: 1,057 + 132 = 1,189.</w:t>
+        <w:t>De 1,189 registros, 1,049 (88.23%) pasaron el esquema y 140 (11.77%) se desviaron a cuarentena con su motivo documentado. Ninguna fila se perdió: 1,049 + 140 = 1,189.</w:t>
       </w:r>
     </w:p>
     <w:tbl>
@@ -194,7 +194,7 @@
               <w:rPr>
                 <w:sz w:val="16"/>
               </w:rPr>
-              <w:t>1,057</w:t>
+              <w:t>1,049</w:t>
             </w:r>
           </w:p>
         </w:tc>
@@ -207,7 +207,7 @@
               <w:rPr>
                 <w:sz w:val="16"/>
               </w:rPr>
-              <w:t>88.9%</w:t>
+              <w:t>88.23%</w:t>
             </w:r>
           </w:p>
         </w:tc>
@@ -235,7 +235,7 @@
               <w:rPr>
                 <w:sz w:val="16"/>
               </w:rPr>
-              <w:t>132</w:t>
+              <w:t>140</w:t>
             </w:r>
           </w:p>
         </w:tc>
@@ -248,7 +248,7 @@
               <w:rPr>
                 <w:sz w:val="16"/>
               </w:rPr>
-              <w:t>11.1%</w:t>
+              <w:t>11.77%</w:t>
             </w:r>
           </w:p>
         </w:tc>
@@ -260,7 +260,7 @@
         <w:spacing w:after="120"/>
       </w:pPr>
       <w:r>
-        <w:t>El resultado que importa para la defensa no es la tasa de aceptación, sino que el pipeline procesó los 1,189 registros sin detenerse una sola vez. Las 24 pruebas de estrés con datos deliberadamente corruptos terminaron con cero excepciones no controladas.</w:t>
+        <w:t>El resultado que importa para la defensa no es la tasa de aceptación, sino que el pipeline procesó los 1,189 registros sin detenerse una sola vez. Las 25 pruebas de estrés con datos deliberadamente corruptos terminaron con cero excepciones no controladas.</w:t>
       </w:r>
     </w:p>
     <w:p>
@@ -913,7 +913,7 @@
         <w:spacing w:after="120"/>
       </w:pPr>
       <w:r>
-        <w:t>Dos de estos hallazgos cambiaron el diseño del validador:</w:t>
+        <w:t>Tres de estos hallazgos cambiaron el diseño del validador:</w:t>
       </w:r>
     </w:p>
     <w:p>
@@ -922,6 +922,14 @@
       </w:pPr>
       <w:r>
         <w:t>E-09 obligó a que la regla aritmética respete flag_outlier. Si la Fase 3 recortó el monto por IQR, la fila deja de cumplir monto = cantidad × precio por culpa de nuestra propia transformación, no del sistema origen. Mandarla a cuarentena sería castigar un dato que nosotros rompimos.</w:t>
+      </w:r>
+    </w:p>
+    <w:p>
+      <w:pPr>
+        <w:pStyle w:val="ListBullet"/>
+      </w:pPr>
+      <w:r>
+        <w:t>E-02 (bots) obligó a una regla propia. La Fase 3 recorta el total inflado x80 al límite del IQR y marca flag_outlier, y la regla aritmética se salta las filas recortadas (E-09), así que 8 de los 12 bots llegaban a la tabla limpia con un monto falso de 8,100.74. La bandera flag_total_inconsistente de la Fase 2 (total reportado distinto de unidades × precio) sobrevive al capping, se lleva al archivo unificado y la regla R3a manda a cuarentena todo pedido que la traiga.</w:t>
       </w:r>
     </w:p>
     <w:p>
@@ -1696,7 +1704,48 @@
               <w:rPr>
                 <w:sz w:val="16"/>
               </w:rPr>
-              <w:t>R3</w:t>
+              <w:t>R3a</w:t>
+            </w:r>
+          </w:p>
+        </w:tc>
+        <w:tc>
+          <w:tcPr>
+            <w:tcW w:type="dxa" w:w="2880"/>
+          </w:tcPr>
+          <w:p>
+            <w:r>
+              <w:rPr>
+                <w:sz w:val="16"/>
+              </w:rPr>
+              <w:t>Un pedido con flag_total_inconsistente (bot, aunque ya esté recortado) va a cuarentena</w:t>
+            </w:r>
+          </w:p>
+        </w:tc>
+        <w:tc>
+          <w:tcPr>
+            <w:tcW w:type="dxa" w:w="2880"/>
+          </w:tcPr>
+          <w:p>
+            <w:r>
+              <w:rPr>
+                <w:sz w:val="16"/>
+              </w:rPr>
+              <w:t>E-02</w:t>
+            </w:r>
+          </w:p>
+        </w:tc>
+      </w:tr>
+      <w:tr>
+        <w:tc>
+          <w:tcPr>
+            <w:tcW w:type="dxa" w:w="2880"/>
+          </w:tcPr>
+          <w:p>
+            <w:r>
+              <w:rPr>
+                <w:sz w:val="16"/>
+              </w:rPr>
+              <w:t>R3b</w:t>
             </w:r>
           </w:p>
         </w:tc>
@@ -1722,7 +1771,7 @@
               <w:rPr>
                 <w:sz w:val="16"/>
               </w:rPr>
-              <w:t>E-01, E-02, E-09</w:t>
+              <w:t>E-01, E-09</w:t>
             </w:r>
           </w:p>
         </w:tc>
@@ -2220,6 +2269,47 @@
               <w:rPr>
                 <w:sz w:val="16"/>
               </w:rPr>
+              <w:t>Total inflado x80 (bot)</w:t>
+            </w:r>
+          </w:p>
+        </w:tc>
+        <w:tc>
+          <w:tcPr>
+            <w:tcW w:type="dxa" w:w="2880"/>
+          </w:tcPr>
+          <w:p>
+            <w:r>
+              <w:rPr>
+                <w:sz w:val="16"/>
+              </w:rPr>
+              <w:t>8</w:t>
+            </w:r>
+          </w:p>
+        </w:tc>
+        <w:tc>
+          <w:tcPr>
+            <w:tcW w:type="dxa" w:w="2880"/>
+          </w:tcPr>
+          <w:p>
+            <w:r>
+              <w:rPr>
+                <w:sz w:val="16"/>
+              </w:rPr>
+              <w:t>0.67%</w:t>
+            </w:r>
+          </w:p>
+        </w:tc>
+      </w:tr>
+      <w:tr>
+        <w:tc>
+          <w:tcPr>
+            <w:tcW w:type="dxa" w:w="2880"/>
+          </w:tcPr>
+          <w:p>
+            <w:r>
+              <w:rPr>
+                <w:sz w:val="16"/>
+              </w:rPr>
               <w:t>Duplicado de negocio</w:t>
             </w:r>
           </w:p>
@@ -2274,7 +2364,7 @@
               <w:rPr>
                 <w:sz w:val="16"/>
               </w:rPr>
-              <w:t>132</w:t>
+              <w:t>140</w:t>
             </w:r>
           </w:p>
         </w:tc>
@@ -2287,7 +2377,7 @@
               <w:rPr>
                 <w:sz w:val="16"/>
               </w:rPr>
-              <w:t>11.1%</w:t>
+              <w:t>11.77%</w:t>
             </w:r>
           </w:p>
         </w:tc>
@@ -2321,7 +2411,7 @@
         <w:spacing w:after="120"/>
       </w:pPr>
       <w:r>
-        <w:t>Se inyectaron 24 registros deliberadamente corruptos. El criterio de éxito no es que el pipeline los acepte, sino que los rechace con un mensaje explícito y sin lanzar una excepción no controlada.</w:t>
+        <w:t>Se inyectaron 25 registros deliberadamente corruptos. El criterio de éxito no es que el pipeline los acepte, sino que los rechace con un mensaje explícito y sin lanzar una excepción no controlada.</w:t>
       </w:r>
     </w:p>
     <w:tbl>
@@ -2402,7 +2492,7 @@
               <w:rPr>
                 <w:sz w:val="16"/>
               </w:rPr>
-              <w:t>23</w:t>
+              <w:t>24</w:t>
             </w:r>
           </w:p>
         </w:tc>
@@ -3039,7 +3129,7 @@
               <w:rPr>
                 <w:sz w:val="16"/>
               </w:rPr>
-              <w:t>1,057</w:t>
+              <w:t>1,049</w:t>
             </w:r>
           </w:p>
         </w:tc>
@@ -3080,7 +3170,7 @@
               <w:rPr>
                 <w:sz w:val="16"/>
               </w:rPr>
-              <w:t>132</w:t>
+              <w:t>140</w:t>
             </w:r>
           </w:p>
         </w:tc>
@@ -3168,7 +3258,7 @@
         <w:t xml:space="preserve">Prueba explícita: </w:t>
       </w:r>
       <w:r>
-        <w:t>No basta con afirmar que el rollback funciona: se probó contra la base real. Se intentó insertar un registro con cantidad = −99, que viola el CHECK (cantidad &gt; 0). El motor lanzó IntegrityError, el pipeline lo capturó, ejecutó rollback y el conteo de la tabla antes y después de la operación fue idéntico: 1,057 filas. La atomicidad queda demostrada, no asumida.</w:t>
+        <w:t>No basta con afirmar que el rollback funciona: se probó contra la base real. Se intentó insertar un registro con cantidad = −99, que viola el CHECK (cantidad &gt; 0). El motor lanzó IntegrityError, el pipeline lo capturó, ejecutó rollback y el conteo de la tabla antes y después de la operación fue idéntico: 1,049 filas. La atomicidad queda demostrada, no asumida.</w:t>
       </w:r>
     </w:p>
     <w:p>
@@ -3555,7 +3645,7 @@
               <w:rPr>
                 <w:sz w:val="16"/>
               </w:rPr>
-              <w:t>103</w:t>
+              <w:t>95</w:t>
             </w:r>
           </w:p>
         </w:tc>
@@ -3568,7 +3658,7 @@
               <w:rPr>
                 <w:sz w:val="16"/>
               </w:rPr>
-              <w:t>448,525.29</w:t>
+              <w:t>416,122.33</w:t>
             </w:r>
           </w:p>
         </w:tc>
@@ -3609,7 +3699,7 @@
               <w:rPr>
                 <w:sz w:val="16"/>
               </w:rPr>
-              <w:t>1057</w:t>
+              <w:t>1049</w:t>
             </w:r>
           </w:p>
         </w:tc>
@@ -3622,7 +3712,7 @@
               <w:rPr>
                 <w:sz w:val="16"/>
               </w:rPr>
-              <w:t>4,107,291.48</w:t>
+              <w:t>4,074,888.52</w:t>
             </w:r>
           </w:p>
         </w:tc>
@@ -3640,7 +3730,7 @@
         <w:t xml:space="preserve">Lectura: </w:t>
       </w:r>
       <w:r>
-        <w:t>La tienda física concentra el 77.1% del importe facturado con menos pedidos que el canal online. Su segmento ALTO por sí solo (265 pedidos) factura más que el canal online completo. El online vende volumen en el segmento BAJO: 202 pedidos que apenas representan 3.4% del importe. Son dos negocios con perfiles distintos, y la discretización de la Fase 5 es lo que permite verlo de un vistazo.</w:t>
+        <w:t>La tienda física concentra el 77.7% del importe facturado con menos pedidos que el canal online. Su segmento ALTO por sí solo (265 pedidos) factura más que el canal online completo. El online vende volumen en el segmento BAJO: 202 pedidos que apenas representan 3.4% del importe. Son dos negocios con perfiles distintos, y la discretización de la Fase 5 es lo que permite verlo de un vistazo.</w:t>
       </w:r>
     </w:p>
     <w:p>
@@ -3656,7 +3746,7 @@
         <w:spacing w:after="120"/>
       </w:pPr>
       <w:r>
-        <w:t>El pipeline quedó completo de extremo a extremo: de 1,189 registros crudos integrados a 1,057 ventas validadas en base de datos, con 132 registros aislados en cuarentena y cada uno con su causa documentada. Ninguna fila se perdió ni se duplicó en el trayecto.</w:t>
+        <w:t>El pipeline quedó completo de extremo a extremo: de 1,189 registros crudos integrados a 1,049 ventas validadas en base de datos, con 140 registros aislados en cuarentena y cada uno con su causa documentada. Ninguna fila se perdió ni se duplicó en el trayecto.</w:t>
       </w:r>
     </w:p>
     <w:p>

</xml_diff>